<commit_message>
Extend Round 8 public inversion attacks and repair research evidence
Prove oracle-only local inversion, exact public fiber sampling, and a scoped correctness-to-key-recovery obstruction. Add a global constant-shift criterion and explicit high-width easy families, with model boundaries and public-only regression tests.

Fix the Round-6 dictionary-order defect, exact probability-budget handling, graph-width and ideal-span claims, and stale document publication checks. Preserve prior proofs, rebuild both Word/PDF pairs, and record all 15 verification outputs with source hashes.

This is a cryptanalytic research update. It does not establish a secure replacement KEM, concrete security levels, or formal KEM-security closure.
</commit_message>
<xml_diff>
--- a/manuscript/SG_DIFRA_REVISED.docx
+++ b/manuscript/SG_DIFRA_REVISED.docx
@@ -123,7 +123,7 @@
         <w:t xml:space="preserve"> </w:t>
       </w:r>
       <w:r>
-        <w:t xml:space="preserve">10</w:t>
+        <w:t xml:space="preserve">11</w:t>
       </w:r>
       <w:r>
         <w:t xml:space="preserve"> </w:t>
@@ -177,7 +177,7 @@
         <w:pStyle w:val="Date"/>
       </w:pPr>
       <w:r>
-        <w:t xml:space="preserve">10</w:t>
+        <w:t xml:space="preserve">11</w:t>
       </w:r>
       <w:r>
         <w:t xml:space="preserve"> </w:t>
@@ -5369,7 +5369,7 @@
         </m:d>
       </m:oMath>
       <w:r>
-        <w:t xml:space="preserve">. All public row labels initially are sampled independently and uniformly from</w:t>
+        <w:t xml:space="preserve">. All public row labels initially are sampled independently and uniformly from the nonzero vectors of</w:t>
       </w:r>
       <w:r>
         <w:t xml:space="preserve"> </w:t>
@@ -5387,27 +5387,6 @@
             </m:r>
           </m:sup>
         </m:sSup>
-        <m:r>
-          <m:rPr>
-            <m:sty m:val="p"/>
-          </m:rPr>
-          <m:t>\</m:t>
-        </m:r>
-        <m:r>
-          <m:rPr>
-            <m:sty m:val="p"/>
-          </m:rPr>
-          <m:t>{</m:t>
-        </m:r>
-        <m:r>
-          <m:t>0</m:t>
-        </m:r>
-        <m:r>
-          <m:rPr>
-            <m:sty m:val="p"/>
-          </m:rPr>
-          <m:t>}</m:t>
-        </m:r>
       </m:oMath>
       <w:r>
         <w:t xml:space="preserve">. In each good bucket replace exactly one label with</w:t>
@@ -6052,19 +6031,28 @@
             </m:rPr>
             <m:t>=</m:t>
           </m:r>
+          <m:r>
+            <m:rPr>
+              <m:sty m:val="p"/>
+            </m:rPr>
+            <m:t>floor</m:t>
+          </m:r>
           <m:d>
             <m:dPr>
-              <m:begChr m:val="⌊"/>
-              <m:endChr m:val="⌋"/>
+              <m:begChr m:val="("/>
+              <m:endChr m:val=")"/>
               <m:sepChr m:val=""/>
               <m:grow/>
             </m:dPr>
             <m:e>
-              <m:f>
-                <m:fPr>
-                  <m:type m:val="bar"/>
-                </m:fPr>
-                <m:num>
+              <m:d>
+                <m:dPr>
+                  <m:begChr m:val="("/>
+                  <m:endChr m:val=")"/>
+                  <m:sepChr m:val=""/>
+                  <m:grow/>
+                </m:dPr>
+                <m:e>
                   <m:r>
                     <m:t>M</m:t>
                   </m:r>
@@ -6077,13 +6065,17 @@
                   <m:r>
                     <m:t>u</m:t>
                   </m:r>
-                </m:num>
-                <m:den>
-                  <m:r>
-                    <m:t>2</m:t>
-                  </m:r>
-                </m:den>
-              </m:f>
+                </m:e>
+              </m:d>
+              <m:r>
+                <m:rPr>
+                  <m:sty m:val="p"/>
+                </m:rPr>
+                <m:t>/</m:t>
+              </m:r>
+              <m:r>
+                <m:t>2</m:t>
+              </m:r>
             </m:e>
           </m:d>
           <m:r>
@@ -9076,7 +9068,19 @@
         <w:pStyle w:val="FirstParagraph"/>
       </w:pPr>
       <w:r>
-        <w:t xml:space="preserve">The union bound does not address high-weight relations or non-linear distinguishers. Exact finite arithmetic and toy regressions are stored in `formal-verification-and-mathematical-proofs/`.</w:t>
+        <w:t xml:space="preserve">The union bound does not address high-weight relations or non-linear distinguishers. Exact finite arithmetic and toy regressions are stored in</w:t>
+      </w:r>
+      <w:r>
+        <w:t xml:space="preserve"> </w:t>
+      </w:r>
+      <w:r>
+        <w:rPr>
+          <w:rStyle w:val="VerbatimChar"/>
+        </w:rPr>
+        <w:t xml:space="preserve">formal-verification-and-mathematical-proofs/</w:t>
+      </w:r>
+      <w:r>
+        <w:t xml:space="preserve">.</w:t>
       </w:r>
     </w:p>
     <w:bookmarkEnd w:id="38"/>
@@ -10713,7 +10717,34 @@
         <w:pStyle w:val="FirstParagraph"/>
       </w:pPr>
       <w:r>
-        <w:t xml:space="preserve">Run `python formal-verification-and-mathematical-proofs/test_sg_difra.py` and `python formal-verification-and-mathematical-proofs/profile_bounds.py`. A passing run is evidence only for the printed fixtures and calculations. The project status is</w:t>
+        <w:t xml:space="preserve">Run</w:t>
+      </w:r>
+      <w:r>
+        <w:t xml:space="preserve"> </w:t>
+      </w:r>
+      <w:r>
+        <w:rPr>
+          <w:rStyle w:val="VerbatimChar"/>
+        </w:rPr>
+        <w:t xml:space="preserve">python formal-verification-and-mathematical-proofs/test_sg_difra.py</w:t>
+      </w:r>
+      <w:r>
+        <w:t xml:space="preserve"> </w:t>
+      </w:r>
+      <w:r>
+        <w:t xml:space="preserve">and</w:t>
+      </w:r>
+      <w:r>
+        <w:t xml:space="preserve"> </w:t>
+      </w:r>
+      <w:r>
+        <w:rPr>
+          <w:rStyle w:val="VerbatimChar"/>
+        </w:rPr>
+        <w:t xml:space="preserve">python formal-verification-and-mathematical-proofs/profile_bounds.py</w:t>
+      </w:r>
+      <w:r>
+        <w:t xml:space="preserve">. A passing run is evidence only for the printed fixtures and calculations. The project status is</w:t>
       </w:r>
       <w:r>
         <w:t xml:space="preserve"> </w:t>
@@ -10932,6 +10963,32 @@
       </w:r>
     </w:p>
     <w:bookmarkEnd w:id="47"/>
+    <w:bookmarkStart w:id="48" w:name="appendix-d.-follow-up-on-11-october-2026"/>
+    <w:p>
+      <w:pPr>
+        <w:pStyle w:val="Heading1"/>
+      </w:pPr>
+      <w:r>
+        <w:t xml:space="preserve">Appendix D. Follow-up on 11 October 2026</w:t>
+      </w:r>
+    </w:p>
+    <w:p>
+      <w:pPr>
+        <w:pStyle w:val="FirstParagraph"/>
+      </w:pPr>
+      <w:r>
+        <w:t xml:space="preserve">The active manuscript now proves public local inversion through an evaluation interface whenever the nonlinear table size is polynomial, plus exact uniform fiber sampling. For the precisely specified attempted wrapper that samples uniform inputs and publishes only the local function output, correctness forces efficient public session-key recovery up to the quantified error terms. A separate public global-shift theorem gives source-form families of unbounded primal width that still admit polynomial witness recovery. These statements have distinct hypotheses and do not break every possible global KEM.</w:t>
+      </w:r>
+    </w:p>
+    <w:p>
+      <w:pPr>
+        <w:pStyle w:val="BodyText"/>
+      </w:pPr>
+      <w:r>
+        <w:t xml:space="preserve">The active document contains the full proofs as Theorem 4.8, Corollaries 4.8a–b and Theorem 12.10, with accompanying reproducible scripts. A dictionary-order bug in the Round-6 attack was repaired with a failing-then-passing regression. The three historical profiles still have no established security levels; no secure replacement KEM or machine-checked KEM-security proof is claimed. This short document remains historical context.</w:t>
+      </w:r>
+    </w:p>
+    <w:bookmarkEnd w:id="48"/>
     <w:sectPr/>
   </w:body>
 </w:document>

</xml_diff>